<commit_message>
SentinURL v3.0.0-ultimate: Finalized Data Core, Continuous Learning, and Stability Package
</commit_message>
<xml_diff>
--- a/documents/Phishing link.docx
+++ b/documents/Phishing link.docx
@@ -60,6 +60,16 @@
             <w:rStyle w:val="Hyperlink"/>
           </w:rPr>
           <w:t>https://archive.ics.uci.edu/dataset/967/phiusiil+phishing+url+dataset</w:t>
+        </w:r>
+      </w:hyperlink>
+    </w:p>
+    <w:p>
+      <w:hyperlink r:id="rId9" w:history="1">
+        <w:r>
+          <w:rPr>
+            <w:rStyle w:val="Hyperlink"/>
+          </w:rPr>
+          <w:t>https://www.kaggle.com/datasets/taruntiwarihp/phishing-site-urls</w:t>
         </w:r>
       </w:hyperlink>
     </w:p>

</xml_diff>